<commit_message>
New Feature: Live API Tester in dashboard
</commit_message>
<xml_diff>
--- a/MLOps Final Project.docx
+++ b/MLOps Final Project.docx
@@ -255,7 +255,7 @@
           <w:color w:val="000000" w:themeColor="text1"/>
           <w:kern w:val="0"/>
         </w:rPr>
-        <w:pict w14:anchorId="00B1AAC9">
+        <w:pict w14:anchorId="4E4C14E4">
           <v:rect id="_x0000_i1032" alt="" style="width:468pt;height:.05pt;mso-width-percent:0;mso-height-percent:0;mso-width-percent:0;mso-height-percent:0" o:hralign="center" o:hrstd="t" o:hr="t" fillcolor="#a0a0a0" stroked="f"/>
         </w:pict>
       </w:r>
@@ -395,7 +395,7 @@
           <w:color w:val="000000" w:themeColor="text1"/>
           <w:kern w:val="0"/>
         </w:rPr>
-        <w:pict w14:anchorId="7690A8B9">
+        <w:pict w14:anchorId="0DC72004">
           <v:rect id="_x0000_i1031" alt="" style="width:468pt;height:.05pt;mso-width-percent:0;mso-height-percent:0;mso-width-percent:0;mso-height-percent:0" o:hralign="center" o:hrstd="t" o:hr="t" fillcolor="#a0a0a0" stroked="f"/>
         </w:pict>
       </w:r>
@@ -472,7 +472,7 @@
           <w:color w:val="000000" w:themeColor="text1"/>
           <w:kern w:val="0"/>
         </w:rPr>
-        <w:pict w14:anchorId="0D7AD9A4">
+        <w:pict w14:anchorId="395508BA">
           <v:rect id="_x0000_i1030" alt="" style="width:468pt;height:.05pt;mso-width-percent:0;mso-height-percent:0;mso-width-percent:0;mso-height-percent:0" o:hralign="center" o:hrstd="t" o:hr="t" fillcolor="#a0a0a0" stroked="f"/>
         </w:pict>
       </w:r>
@@ -1065,7 +1065,7 @@
           <w:color w:val="000000" w:themeColor="text1"/>
           <w:kern w:val="0"/>
         </w:rPr>
-        <w:pict w14:anchorId="312EC8B1">
+        <w:pict w14:anchorId="36725A47">
           <v:rect id="_x0000_i1029" alt="" style="width:468pt;height:.05pt;mso-width-percent:0;mso-height-percent:0;mso-width-percent:0;mso-height-percent:0" o:hralign="center" o:hrstd="t" o:hr="t" fillcolor="#a0a0a0" stroked="f"/>
         </w:pict>
       </w:r>
@@ -2252,7 +2252,7 @@
           <w:color w:val="000000" w:themeColor="text1"/>
           <w:kern w:val="0"/>
         </w:rPr>
-        <w:pict w14:anchorId="79119102">
+        <w:pict w14:anchorId="232B720C">
           <v:rect id="_x0000_i1028" alt="" style="width:468pt;height:.05pt;mso-width-percent:0;mso-height-percent:0;mso-width-percent:0;mso-height-percent:0" o:hralign="center" o:hrstd="t" o:hr="t" fillcolor="#a0a0a0" stroked="f"/>
         </w:pict>
       </w:r>
@@ -3352,7 +3352,7 @@
           <w:color w:val="000000" w:themeColor="text1"/>
           <w:kern w:val="0"/>
         </w:rPr>
-        <w:pict w14:anchorId="10AE4F56">
+        <w:pict w14:anchorId="280E0C28">
           <v:rect id="_x0000_i1027" alt="" style="width:468pt;height:.05pt;mso-width-percent:0;mso-height-percent:0;mso-width-percent:0;mso-height-percent:0" o:hralign="center" o:hrstd="t" o:hr="t" fillcolor="#a0a0a0" stroked="f"/>
         </w:pict>
       </w:r>
@@ -4026,7 +4026,7 @@
           <w:color w:val="000000" w:themeColor="text1"/>
           <w:kern w:val="0"/>
         </w:rPr>
-        <w:pict w14:anchorId="63447E9B">
+        <w:pict w14:anchorId="38F94CF1">
           <v:rect id="_x0000_i1026" alt="" style="width:468pt;height:.05pt;mso-width-percent:0;mso-height-percent:0;mso-width-percent:0;mso-height-percent:0" o:hralign="center" o:hrstd="t" o:hr="t" fillcolor="#a0a0a0" stroked="f"/>
         </w:pict>
       </w:r>
@@ -8184,7 +8184,7 @@
           <w:color w:val="000000" w:themeColor="text1"/>
           <w:kern w:val="0"/>
         </w:rPr>
-        <w:pict w14:anchorId="5532C28F">
+        <w:pict w14:anchorId="6ED620F2">
           <v:rect id="_x0000_i1025" alt="" style="width:468pt;height:.05pt;mso-width-percent:0;mso-height-percent:0;mso-width-percent:0;mso-height-percent:0" o:hralign="center" o:hrstd="t" o:hr="t" fillcolor="#a0a0a0" stroked="f"/>
         </w:pict>
       </w:r>

</xml_diff>